<commit_message>
paper: anti AI-slop pass for academic style
- All em-dashes (11) replaced with appropriate punctuation
  (commas, parens, colons), preserving 2 legitimate ones
  (markdown header + Ding et al. paper title)
- 'in ways that ... cannot match' AI sentence rewritten
- 'stems from' / 'reflects ... in ways that' patterns reformulated
- 'non-obvious' (4 occurrences) varied with subtle/unexpected
- 'therefore' overuse reduced from 5 to 2
- 'in two distinct capacities' / 'as obtained' AI tells removed
- 'represents' filler replaced with constitutes/is
- Large Language Model abbreviated to LLM after first introduction
- 'Three findings emerge' / 'demonstrate' patterns varied
- Final word count: 4974 (under 5000 target)
</commit_message>
<xml_diff>
--- a/paper/IFKAD2026_Sasso_DeMauro_v3.docx
+++ b/paper/IFKAD2026_Sasso_DeMauro_v3.docx
@@ -70,7 +70,7 @@
         <w:pStyle w:val="FirstParagraph"/>
       </w:pPr>
       <w:r>
-        <w:t xml:space="preserve">Automated Short Answer Grading (ASAG) is increasingly deployed in high-stakes educational contexts, yet the dominant evaluation paradigm focuses primarily on agreement with human raters, overlooking robustness as a complementary quality dimension. Robustness — the consistency of grading behaviour under controlled, meaning-aware input transformations — speaks directly to construct validity, the degree to which an assessment measures what it claims to measure, and is a precondition for trustworthy automated decisions in education.</w:t>
+        <w:t xml:space="preserve">Automated Short Answer Grading (ASAG) is increasingly deployed in high-stakes educational contexts, yet the dominant evaluation paradigm focuses primarily on agreement with human raters, overlooking robustness as a complementary quality dimension. Robustness, defined as the consistency of grading behaviour under controlled, meaning-aware input transformations, bears directly on construct validity, the degree to which an assessment measures what it claims to measure, and conditions the trustworthiness of automated decisions in education.</w:t>
       </w:r>
     </w:p>
     <w:p>
@@ -86,7 +86,7 @@
         <w:pStyle w:val="BodyText"/>
       </w:pPr>
       <w:r>
-        <w:t xml:space="preserve">We apply the framework to a benchmark ASAG dataset of science short answers and compare a trained machine-learning baseline with zero-shot Large Language Model graders evaluated at two prompting levels, with and without access to a reference answer. Three findings emerge. First, trained graders exhibit substantial robustness degradation under realistic cross-question evaluation, suggesting that standard within-question benchmarks overestimate operational reliability. Second, zero-shot LLM graders demonstrate stronger robustness on invariance and sensitivity dimensions while remaining comparatively less vulnerable to adversarial manipulation, although residual sensitivity failures follow a structured hierarchy across perturbation types. Finally, providing reference answers introduces a non-obvious trade-off — improved consistency on meaning-preserving variations but increased susceptibility to keyword-based gaming — which is invisible to single-metric evaluation.</w:t>
+        <w:t xml:space="preserve">We apply the framework to a benchmark ASAG dataset of science short answers and compare a trained machine-learning baseline with zero-shot Large Language Model graders evaluated at two prompting levels, with and without access to a reference answer. Three findings emerge. First, trained graders exhibit substantial robustness degradation under realistic cross-question evaluation, suggesting that standard within-question benchmarks overestimate operational reliability. Second, zero-shot LLM graders exhibit stronger robustness on invariance and sensitivity dimensions while remaining comparatively less vulnerable to adversarial manipulation, although residual sensitivity failures display a stable hierarchy across perturbation types. Finally, providing reference answers introduces a subtle trade-off, with improved consistency on meaning-preserving variations but increased susceptibility to keyword-based gaming, which is invisible to single-metric evaluation.</w:t>
       </w:r>
     </w:p>
     <w:p>
@@ -155,7 +155,7 @@
         <w:pStyle w:val="FirstParagraph"/>
       </w:pPr>
       <w:r>
-        <w:t xml:space="preserve">Automated Short Answer Grading (ASAG) systems assign grades to free-text student responses by comparison with reference answers. The dominant evaluation paradigm — accuracy or Quadratic Weighted Kappa against gold labels — reveals an important blind spot: a grader may agree with human raters on clean test data yet behave erratically when inputs vary in superficial, meaning-preserving ways. Such inconsistency violates construct validity and undermines the pedagogical purpose of assessment (Messick, 1989; Williamson et al., 2012). Operational ASAG systems are also vulnerable to simple adversarial inputs (Ding et al., 2020; Kumar et al., 2020; Filighera et al., 2024), yet such vulnerabilities remain largely absent from standard benchmarking.</w:t>
+        <w:t xml:space="preserve">Automated Short Answer Grading (ASAG) systems assign grades to free-text student responses by comparison with reference answers. The dominant evaluation paradigm, which relies on accuracy or Quadratic Weighted Kappa against gold labels, reveals an important blind spot: a grader may agree with human raters on clean test data yet behave erratically when inputs vary in superficial, meaning-preserving ways. Such inconsistency violates construct validity and undermines the pedagogical purpose of assessment (Messick, 1989; Williamson et al., 2012). Operational ASAG systems are also vulnerable to simple adversarial inputs (Ding et al., 2020; Kumar et al., 2020; Filighera et al., 2024), yet such vulnerabilities remain largely absent from standard benchmarking.</w:t>
       </w:r>
     </w:p>
     <w:p>
@@ -171,7 +171,7 @@
         <w:pStyle w:val="BodyText"/>
       </w:pPr>
       <w:r>
-        <w:t xml:space="preserve">We apply this framework to the SemEval 2013 Beetle dataset (5,199 answers, 42 questions), evaluating a hybrid ML baseline and a Large Language Model grader (GPT-5.4 mini) at two prompting levels. The contributions of this work are threefold: a perturbation-first evaluation framework grounded in validity theory; a dual-protocol design that exposes the extent to which within-question evaluations overestimate operational reliability; and a cross-paradigm comparison that documents a structured sensitivity-blindness gradient and a non-obvious gaming trade-off introduced by reference-answer prompting.</w:t>
+        <w:t xml:space="preserve">We apply this framework to the SemEval 2013 Beetle dataset (5,199 answers, 42 questions), evaluating a hybrid ML baseline and a Large Language Model (LLM) grader (GPT-5.4 mini) at two prompting levels. The contributions of this work are threefold: a perturbation-first evaluation framework grounded in validity theory; a dual-protocol design that exposes the extent to which within-question evaluations overestimate operational reliability; and a cross-paradigm comparison that documents a structured sensitivity-blindness gradient and an unexpected gaming trade-off introduced by reference-answer prompting.</w:t>
       </w:r>
     </w:p>
     <w:p>
@@ -183,7 +183,7 @@
           <wp:inline>
             <wp:extent cx="5727700" cy="3632200"/>
             <wp:effectExtent b="0" l="0" r="0" t="0"/>
-            <wp:docPr descr="Figure 1 — Framework overview and headline finding" title="" id="30" name="Picture"/>
+            <wp:docPr descr="Figure 1: Framework overview and headline finding" title="" id="30" name="Picture"/>
             <a:graphic>
               <a:graphicData uri="http://schemas.openxmlformats.org/drawingml/2006/picture">
                 <pic:pic>
@@ -226,7 +226,7 @@
         <w:pStyle w:val="ImageCaption"/>
       </w:pPr>
       <w:r>
-        <w:t xml:space="preserve">Figure 1 — Framework overview and headline finding</w:t>
+        <w:t xml:space="preserve">Figure 1: Framework overview and headline finding</w:t>
       </w:r>
     </w:p>
     <w:p>
@@ -292,7 +292,7 @@
         <w:t xml:space="preserve"> </w:t>
       </w:r>
       <w:r>
-        <w:t xml:space="preserve">it on deletion — the L1 paradox.</w:t>
+        <w:t xml:space="preserve">it on deletion: the L1 paradox.</w:t>
       </w:r>
     </w:p>
     <w:p>
@@ -344,7 +344,7 @@
         <w:pStyle w:val="FirstParagraph"/>
       </w:pPr>
       <w:r>
-        <w:t xml:space="preserve">The limits of agreement-based evaluation are best understood through construct validity — the degree to which an assessment measures what it claims to measure (Messick, 1989; Kane, 2006). Messick’s framework identifies two principal threats:</w:t>
+        <w:t xml:space="preserve">The limits of agreement-based evaluation are best understood through construct validity, that is, the degree to which an assessment measures what it claims to measure (Messick, 1989; Kane, 2006). Messick’s framework identifies two principal threats:</w:t>
       </w:r>
       <w:r>
         <w:t xml:space="preserve"> </w:t>
@@ -376,7 +376,7 @@
         <w:t xml:space="preserve"> </w:t>
       </w:r>
       <w:r>
-        <w:t xml:space="preserve">(the assessment fails to capture meaningful aspects of the construct, e.g. a grader missing a negation that inverts meaning). To these, the literature on automated scoring has added a third threat specific to algorithmic systems —</w:t>
+        <w:t xml:space="preserve">(the assessment fails to capture meaningful aspects of the construct, e.g. a grader missing a negation that inverts meaning). To these, the literature on automated scoring has added a third threat specific to algorithmic systems,</w:t>
       </w:r>
       <w:r>
         <w:t xml:space="preserve"> </w:t>
@@ -627,7 +627,7 @@
           <w:b/>
           <w:bCs/>
         </w:rPr>
-        <w:t xml:space="preserve">Box 1 — Examples</w:t>
+        <w:t xml:space="preserve">Box 1. Examples</w:t>
       </w:r>
       <w:r>
         <w:t xml:space="preserve"> </w:t>
@@ -963,7 +963,7 @@
         <w:t xml:space="preserve"> </w:t>
       </w:r>
       <w:r>
-        <w:t xml:space="preserve">ground truth — whether a candidate variant preserves meaning as intended — and are distinct from the</w:t>
+        <w:t xml:space="preserve">ground truth (whether a candidate variant preserves meaning as intended), as distinguished from the</w:t>
       </w:r>
       <w:r>
         <w:t xml:space="preserve"> </w:t>
@@ -1119,7 +1119,7 @@
         <w:t xml:space="preserve"> </w:t>
       </w:r>
       <w:r>
-        <w:t xml:space="preserve">is the difference between A and B aggregate metrics, macro-averaged across questions. Zero-shot Large Language Model graders receive an identical prompt regardless of split, so their A and B results are equivalent up to sampling noise; we therefore evaluate them on absolute metrics and compare against the trained baseline’s Protocol A, the most demanding condition.</w:t>
+        <w:t xml:space="preserve">is the difference between A and B aggregate metrics, macro-averaged across questions. Zero-shot LLM graders receive an identical prompt regardless of split, so their A and B results are equivalent up to sampling noise, and we evaluate them on absolute metrics and compare against the trained baseline’s Protocol A, the most demanding condition.</w:t>
       </w:r>
     </w:p>
     <w:p>
@@ -1276,7 +1276,7 @@
         <w:pStyle w:val="FirstParagraph"/>
       </w:pPr>
       <w:r>
-        <w:t xml:space="preserve">Results are organised in four parts: dual-protocol analysis of the trained HybridGrader (5.1); cross-paradigm comparison with the zero-shot Large Language Model, including reference-answer availability (5.2); score-distribution artefacts and the floor effect (5.3); and the structured sensitivity-blindness gradient (5.4).</w:t>
+        <w:t xml:space="preserve">Results are organised in four parts: dual-protocol analysis of the trained HybridGrader (5.1); cross-paradigm comparison with the zero-shot LLM, including reference-answer availability (5.2); score-distribution artefacts and the floor effect (5.3); and the structured sensitivity-blindness gradient (5.4).</w:t>
       </w:r>
     </w:p>
     <w:bookmarkStart w:id="48" w:name="Xc809b316f312309586489cdd55a59630b36253f"/>
@@ -1582,7 +1582,7 @@
         <w:pStyle w:val="FirstParagraph"/>
       </w:pPr>
       <w:r>
-        <w:t xml:space="preserve">Table 2 reports the zero-shot Large Language Model’s absolute robustness metrics, compared against the HybridGrader’s Protocol A results.</w:t>
+        <w:t xml:space="preserve">Table 2 reports the zero-shot LLM’s absolute robustness metrics, compared against the HybridGrader’s Protocol A results.</w:t>
       </w:r>
     </w:p>
     <w:p>
@@ -1864,7 +1864,7 @@
         <w:pStyle w:val="BodyText"/>
       </w:pPr>
       <w:r>
-        <w:t xml:space="preserve">Four observations follow from the comparison.</w:t>
+        <w:t xml:space="preserve">Four observations can be drawn from the comparison.</w:t>
       </w:r>
       <w:r>
         <w:t xml:space="preserve"> </w:t>
@@ -1874,7 +1874,7 @@
           <w:i/>
           <w:iCs/>
         </w:rPr>
-        <w:t xml:space="preserve">First, the Large Language Model is more robust to surface variation.</w:t>
+        <w:t xml:space="preserve">First, the LLM is more robust to surface variation.</w:t>
       </w:r>
       <w:r>
         <w:t xml:space="preserve"> </w:t>
@@ -1892,13 +1892,13 @@
           <w:i/>
           <w:iCs/>
         </w:rPr>
-        <w:t xml:space="preserve">Second, the Large Language Model detects meaning-altering perturbations more effectively.</w:t>
-      </w:r>
-      <w:r>
-        <w:t xml:space="preserve"> </w:t>
-      </w:r>
-      <w:r>
-        <w:t xml:space="preserve">SSR_directional rises from 0.140 for the HybridGrader to 0.420 at Level 0 and 0.461 at Level 1, an approximately threefold improvement. The HybridGrader misses 86% of negations, deletions and contradictions, whereas the Large Language Model at Level 1 misses 54%. Adding the reference answer yields only a modest additional gain (+4 pp), indicating that most of the sensitivity advantage stems from semantic processing rather than from a comparison target.</w:t>
+        <w:t xml:space="preserve">Second, the LLM detects meaning-altering perturbations more effectively.</w:t>
+      </w:r>
+      <w:r>
+        <w:t xml:space="preserve"> </w:t>
+      </w:r>
+      <w:r>
+        <w:t xml:space="preserve">SSR_directional rises from 0.140 for the HybridGrader to 0.420 at Level 0 and 0.461 at Level 1, an approximately threefold improvement. The HybridGrader misses 86% of negations, deletions and contradictions, whereas the LLM at Level 1 misses 54%. Adding the reference answer yields only a modest additional gain (+4 pp), indicating that the sensitivity advantage arises predominantly from semantic processing rather than from the comparison target.</w:t>
       </w:r>
     </w:p>
     <w:p>
@@ -1910,13 +1910,13 @@
           <w:i/>
           <w:iCs/>
         </w:rPr>
-        <w:t xml:space="preserve">Third, reference-answer availability introduces a non-obvious gaming trade-off.</w:t>
-      </w:r>
-      <w:r>
-        <w:t xml:space="preserve"> </w:t>
-      </w:r>
-      <w:r>
-        <w:t xml:space="preserve">Providing the reference answer (Level 1) increases gaming susceptibility by 76% relative to Level 0 (ASR 0.118 vs 0.067). The prompt instructs the model to compare the student answer against the reference, so any token overlap becomes evidence of correctness, and when a gaming perturbation injects reference keywords into a wrong response the model registers them as partial understanding. The reference therefore functions as a checklist that an adversarial student can copy from, whereas Level 0, lacking this anchor, must judge the answer on its overall coherence and is correspondingly harder to game.</w:t>
+        <w:t xml:space="preserve">Third, reference-answer availability introduces an unexpected gaming trade-off.</w:t>
+      </w:r>
+      <w:r>
+        <w:t xml:space="preserve"> </w:t>
+      </w:r>
+      <w:r>
+        <w:t xml:space="preserve">Providing the reference answer (Level 1) increases gaming susceptibility by 76% relative to Level 0 (ASR 0.118 vs 0.067). The prompt instructs the model to compare the student answer against the reference, so any token overlap becomes evidence of correctness, and when a gaming perturbation injects reference keywords into a wrong response the model registers them as partial understanding. The reference functions as a checklist from which an adversarial student can copy, whereas Level 0, lacking this anchor, must judge the answer on its overall coherence and is correspondingly harder to game.</w:t>
       </w:r>
     </w:p>
     <w:p>
@@ -1934,7 +1934,7 @@
         <w:t xml:space="preserve"> </w:t>
       </w:r>
       <w:r>
-        <w:t xml:space="preserve">On invariance alone, Level 1 dominates Level 0; on gaming alone, Level 0 dominates Level 1; on sensitivity alone, the two are comparable. The same point applies to the trained baseline: under Protocol B its IVR_flip of 0.179 looks reasonable, yet SSR_directional of 0.120 reveals that this stability partly reflects indiscrimination — the grader rarely changes its score even when it should.</w:t>
+        <w:t xml:space="preserve">On invariance alone, Level 1 dominates Level 0; on gaming alone, Level 0 dominates Level 1; on sensitivity alone, the two are comparable. The same point applies to the trained baseline: under Protocol B its IVR_flip of 0.179 looks reasonable, yet SSR_directional of 0.120 reveals that this stability partly reflects indiscrimination, with the grader rarely changing its score even when it should.</w:t>
       </w:r>
     </w:p>
     <w:bookmarkEnd w:id="49"/>
@@ -1952,7 +1952,7 @@
         <w:pStyle w:val="FirstParagraph"/>
       </w:pPr>
       <w:r>
-        <w:t xml:space="preserve">To rule out the possibility that the lower IVR is an artefact of score compression, we examined the Large Language Model’s label distribution. At Level 0, GPT-5.4 mini exhibits a conservative scoring pattern: 54.3% of answers receive the partially_correct_incomplete label (score 0.5), against 23.1% in the gold distribution. Compression toward the midpoint mechanically reduces IVR, since scores at 0.5 have less room to flip. At Level 1, the distribution becomes substantially more discriminative, closer to the gold distribution, yet IVR_flip continues to fall (0.243 → 0.134). This rules out the score-compression explanation, and the invariance robustness observed reflects genuine semantic stability rather than a statistical artefact.</w:t>
+        <w:t xml:space="preserve">To rule out the possibility that the lower IVR is an artefact of score compression, we examined the LLM’s label distribution. At Level 0, GPT-5.4 mini exhibits a conservative scoring pattern: 54.3% of answers receive the partially_correct_incomplete label (score 0.5), against 23.1% in the gold distribution. Compression toward the midpoint mechanically reduces IVR, since scores at 0.5 have less room to flip. At Level 1, the distribution becomes substantially more discriminative, closer to the gold distribution, yet IVR_flip continues to fall (0.243 → 0.134). This rules out the score-compression explanation, and the invariance robustness observed reflects genuine semantic stability rather than a statistical artefact.</w:t>
       </w:r>
     </w:p>
     <w:p>
@@ -2229,7 +2229,7 @@
         <w:pStyle w:val="FirstParagraph"/>
       </w:pPr>
       <w:r>
-        <w:t xml:space="preserve">Disaggregating SSR by perturbation type reveals that the Large Language Model’s sensitivity failures follow a stable hierarchy (Figure 1b, Table 4): the grader is blindest to deletions, intermediate on negations, and least blind on outright contradictions, and the pattern holds for both prompting levels.</w:t>
+        <w:t xml:space="preserve">Disaggregating SSR by perturbation type reveals that the LLM’s sensitivity failures follow a stable hierarchy (Figure 1b, Table 4): the grader is blindest to deletions, intermediate on negations, and least blind on outright contradictions, and the pattern holds for both prompting levels.</w:t>
       </w:r>
     </w:p>
     <w:p>
@@ -2403,7 +2403,7 @@
         <w:pStyle w:val="BodyText"/>
       </w:pPr>
       <w:r>
-        <w:t xml:space="preserve">Pairwise McNemar tests confirm that the gradient is significant (all six within-grader comparisons p &lt; 0.001). A non-obvious side-effect emerges between graders: adding the reference answer (L1) reduces the miss rate on negation (−10 pp) and contradiction (−3 pp) but</w:t>
+        <w:t xml:space="preserve">Pairwise McNemar tests confirm that the gradient is significant (all six within-grader comparisons p &lt; 0.001). A further side-effect emerges between graders: adding the reference answer (L1) reduces the miss rate on negation (−10 pp) and contradiction (−3 pp) but</w:t>
       </w:r>
       <w:r>
         <w:t xml:space="preserve"> </w:t>
@@ -2419,7 +2419,7 @@
         <w:t xml:space="preserve"> </w:t>
       </w:r>
       <w:r>
-        <w:t xml:space="preserve">it on deletion (+6 pp), a paradox confirmed by paired McNemar on the same answer set (χ² = 51, p &lt; 0.0001). Floor adjustment (Section 5.3) lowers all three rates uniformly without changing the ordering, and even at the bottom (~40% on contradiction in L1) the failure rate represents a substantive deployment risk.</w:t>
+        <w:t xml:space="preserve">it on deletion (+6 pp), a paradox confirmed by paired McNemar on the same answer set (χ² = 51, p &lt; 0.0001). Floor adjustment (Section 5.3) lowers all three rates uniformly without changing the ordering, and even at the bottom (~40% on contradiction in L1) the failure rate constitutes a substantive deployment risk.</w:t>
       </w:r>
     </w:p>
     <w:p>
@@ -2526,7 +2526,7 @@
         <w:pStyle w:val="BodyText"/>
       </w:pPr>
       <w:r>
-        <w:t xml:space="preserve">The most consequential methodological finding is that within-question evaluations systematically overestimate the robustness of trained ASAG graders. The HybridGrader’s invariance violation rate nearly doubles between the in-distribution and cross-question protocols, and its gaming susceptibility rises by roughly two-thirds, effects large enough to translate into deployment surprise. Published ASAG evaluations should therefore include cross-question results alongside in-distribution ones, and report the gap explicitly as a robustness drop.</w:t>
+        <w:t xml:space="preserve">The most consequential methodological finding is that within-question evaluations systematically overestimate the robustness of trained ASAG graders. The HybridGrader’s invariance violation rate nearly doubles between the in-distribution and cross-question protocols, and its gaming susceptibility rises by roughly two-thirds, effects large enough to materially affect deployment. Published ASAG evaluations should therefore include cross-question results alongside in-distribution ones, and report the gap explicitly as a robustness drop.</w:t>
       </w:r>
     </w:p>
     <w:p>
@@ -2534,7 +2534,7 @@
         <w:pStyle w:val="BodyText"/>
       </w:pPr>
       <w:r>
-        <w:t xml:space="preserve">The advantage that the zero-shot Large Language Model exhibits on invariance and sensitivity reflects semantic processing in ways that feature-based scoring cannot match. The HybridGrader relies on lexical overlap that shifts with surface form, whereas the Large Language Model processes the answer as language: a negation, deletion or antonym leaves surface features intact while shifting meaning, defeating feature-based scoring while remaining at least partially visible to a semantic processor. The residual weaknesses in Section 5.4 refine rather than undermine this conclusion, showing that semantic processing protects against meaning-preserving variation more reliably than against meaning-altering omission.</w:t>
+        <w:t xml:space="preserve">The advantage that the zero-shot LLM exhibits on invariance and sensitivity arises from a form of semantic processing that feature-based scoring lacks. The HybridGrader relies on lexical overlap that shifts with surface form, whereas the LLM processes the answer as language: a negation, deletion or antonym leaves surface features intact while shifting meaning, defeating feature-based scoring yet remaining at least partially visible to a semantic processor. The residual weaknesses in Section 5.4 refine rather than undermine this conclusion, showing that semantic processing handles meaning-preserving variation more reliably than meaning-altering omission.</w:t>
       </w:r>
     </w:p>
     <w:p>
@@ -2542,7 +2542,7 @@
         <w:pStyle w:val="BodyText"/>
       </w:pPr>
       <w:r>
-        <w:t xml:space="preserve">Adding the reference answer is the kind of intervention practitioners might expect to improve grading uniformly. It does so for invariance and sensitivity, but for gaming it nearly doubles vulnerability. The mechanism generalises beyond the particular prompt employed here: when the model is instructed to compare the student answer against a reference, any token overlap becomes evidence of correctness, which an adversarial student can exploit. The same checklist mechanism plausibly explains the deletion paradox of Section 5.4: when a domain concept is removed, the reference has no token to compare against while surrounding tokens still match, so the grader reads continued overlap as continued correctness and tolerates the omission. Reference-anchored prompting therefore fails on the same axis on which it succeeds, since token-level matching detects substitutions and negations but cannot detect what is no longer present. Prompt engineering and coherence-first instructions are plausible mitigations, yet such trade-offs remain invisible to single-metric evaluation.</w:t>
+        <w:t xml:space="preserve">Adding the reference answer is an intervention practitioners commonly expect to improve grading uniformly. It does so for invariance and sensitivity, but for gaming it nearly doubles vulnerability. The mechanism generalises beyond the particular prompt employed here: when the model is instructed to compare the student answer against a reference, any token overlap becomes evidence of correctness, which an adversarial student can exploit. The same checklist mechanism plausibly explains the deletion paradox of Section 5.4: when a domain concept is removed, the reference has no token to compare against while surrounding tokens still match, so the grader reads continued overlap as continued correctness and tolerates the omission. Reference-anchored prompting therefore fails on the same axis on which it succeeds, since token-level matching detects substitutions and negations but cannot detect what is no longer present. Prompt engineering and coherence-first instructions are plausible mitigations, yet such trade-offs remain invisible to single-metric evaluation.</w:t>
       </w:r>
     </w:p>
     <w:p>
@@ -2558,7 +2558,7 @@
         <w:pStyle w:val="BodyText"/>
       </w:pPr>
       <w:r>
-        <w:t xml:space="preserve">We acknowledge several limitations that could be object of further research. First, the empirical evidence is restricted to a single dataset (Beetle) covering one science domain, and replication on additional ASAG corpora is necessary to establish the generality of the patterns reported. Second, the corpus lacks structured per-question rubrics, so the contrast between Level 0 and Level 1 prompting serves as a proxy for how additional grading information shapes robustness. Third, the Large Language Model evaluation relies on a single model (GPT-5.4 mini), and cross-vendor as well as frontier-model comparisons are deferred to follow-up work. Finally, perturbations are produced by rule-based generators, and complementary human validation through inter-annotator agreement studies represents a natural extension for the journal version.</w:t>
+        <w:t xml:space="preserve">We acknowledge several limitations that could be object of further research. First, the empirical evidence is restricted to a single dataset (Beetle) covering one science domain, and replication on additional ASAG corpora is necessary to establish the generality of the patterns reported. Second, the corpus lacks structured per-question rubrics, so the contrast between Level 0 and Level 1 prompting serves as a proxy for how additional grading information shapes robustness. Third, the LLM evaluation relies on a single model (GPT-5.4 mini), and cross-vendor as well as frontier-model comparisons are deferred to follow-up work. Finally, perturbations are produced by rule-based generators, and complementary human validation through inter-annotator agreement is a natural extension for the journal version.</w:t>
       </w:r>
     </w:p>
     <w:p>
@@ -2591,7 +2591,7 @@
         <w:pStyle w:val="BodyText"/>
       </w:pPr>
       <w:r>
-        <w:t xml:space="preserve">Applied to the SemEval 2013 Beetle corpus, three findings emerge. The trained ML baseline exhibits a substantial robustness drop under cross-question evaluation (+15.8 pp IVR_flip; +7.4 pp ASR), confirming that within-question benchmarks overestimate operational reliability. The zero-shot Large Language Model grader is markedly more robust on invariance and sensitivity, and less vulnerable to gaming. Adding the reference answer trades a 45% reduction in invariance violations for a 76% increase in gaming susceptibility, a non-obvious trade-off invisible to any single metric. The broader claim is that robustness should be evaluated alongside accuracy as a first-class quality dimension for any ASAG system intended for high-stakes use, and that such evaluation should be multi-dimensional and grounded in validity theory.</w:t>
+        <w:t xml:space="preserve">Applied to the SemEval 2013 Beetle corpus, three findings stand out. The trained ML baseline exhibits a substantial robustness drop under cross-question evaluation (+15.8 pp IVR_flip; +7.4 pp ASR), confirming that within-question benchmarks overestimate operational reliability. The zero-shot LLM grader is markedly more robust on invariance and sensitivity, and less vulnerable to gaming. Adding the reference answer trades a 45% reduction in invariance violations for a 76% increase in gaming susceptibility, a subtle trade-off invisible to any single metric. We argue that robustness should be evaluated alongside accuracy as a first-class quality dimension for any ASAG system intended for high-stakes use, and that such evaluation should be multi-dimensional and grounded in validity theory.</w:t>
       </w:r>
     </w:p>
     <w:p>
@@ -2616,7 +2616,7 @@
         <w:pStyle w:val="FirstParagraph"/>
       </w:pPr>
       <w:r>
-        <w:t xml:space="preserve">This study uses publicly available data from the SemEval 2013 Task 7 Beetle benchmark, which contains anonymised student responses released by the dataset authors for research purposes (Dzikovska et al., 2013). No primary data collection involving human participants was carried out for this work, and no ethical clearance was therefore required.</w:t>
+        <w:t xml:space="preserve">This study uses publicly available data from the SemEval 2013 Task 7 Beetle benchmark, which contains anonymised student responses released by the dataset authors for research purposes (Dzikovska et al., 2013). No primary data collection involving human participants was carried out for the present study, and no ethical clearance was required.</w:t>
       </w:r>
     </w:p>
     <w:bookmarkEnd w:id="55"/>
@@ -2634,7 +2634,7 @@
         <w:pStyle w:val="FirstParagraph"/>
       </w:pPr>
       <w:r>
-        <w:t xml:space="preserve">Artificial intelligence tools were used in two distinct capacities in this work. First, OpenAI’s GPT-5.4 mini was the object of evaluation as one of the graders studied; its prompting configuration, decoding parameters, and access conditions are documented in Section 4.2, and all outputs are reported as obtained. Second, general-purpose large language models (Anthropic Claude and OpenAI GPT) were employed as writing assistants during manuscript preparation, specifically for grammar and style proof-reading, terminology consistency checks, and rephrasing suggestions on author-drafted text. All scientific content, research design, analyses, results, and interpretations are the authors’ own. AI-generated wording was reviewed, edited, and retained only where consistent with the authors’ intent and with the underlying empirical evidence.</w:t>
+        <w:t xml:space="preserve">Artificial intelligence tools were used in two ways. First, OpenAI’s GPT-5.4 mini was the object of evaluation as one of the graders studied; its prompting configuration, decoding parameters, and access conditions are documented in Section 4.2, and the resulting outputs are reported without modification. Second, general-purpose LLMs (Anthropic Claude and OpenAI GPT) were employed as writing assistants during manuscript preparation, specifically for grammar and style proof-reading, terminology consistency checks, and rephrasing suggestions on author-drafted text. All scientific content, research design, analyses, results, and interpretations are the authors’ own. AI-generated wording was reviewed, edited, and retained only where consistent with the authors’ intent and with the underlying empirical evidence.</w:t>
       </w:r>
     </w:p>
     <w:p>

</xml_diff>

<commit_message>
paper: eliminate single-paragraph subsections per professor feedback
Apply professor's general principle (PDF page 10) consistently:
'single-paragraph subsections do not work'.

Section 2 (Theoretical Background): removed all 4 sub-headers
(2.1-2.4), now flows as 5-paragraph academic prose.

Section 3 (Methodology): consolidated 3.1 Framework Architecture
into section opening; merged 3.3 Two-Gate Validation into 3.2
Perturbation Generation (now 'Perturbation Generation and Quality
Validation'); renumbered to 3.1-3.3, all multi-paragraph.

Section 4 (Experimental Setup): removed 4.1 Dataset (single para)
into section opening; renumbered Graders→4.1, Stats→4.2.

Section 5 (Results): removed 5.1 Dual-Protocol Analysis (single
para + table) into section opening; renumbered Cross-Paradigm→5.1,
Score Distribution→5.2, Sensitivity Blindness→5.3.

Updated all cross-references (Section 4.1→4, 4.2→4.1, 3.3→3.1,
5.2→5.1, 5.3→5.2, 5.4→5.3). Final word count: 4955.
</commit_message>
<xml_diff>
--- a/paper/IFKAD2026_Sasso_DeMauro_v3.docx
+++ b/paper/IFKAD2026_Sasso_DeMauro_v3.docx
@@ -303,7 +303,7 @@
       </w:r>
     </w:p>
     <w:bookmarkEnd w:id="32"/>
-    <w:bookmarkStart w:id="37" w:name="theoretical-background"/>
+    <w:bookmarkStart w:id="33" w:name="theoretical-background"/>
     <w:p>
       <w:pPr>
         <w:pStyle w:val="Heading2"/>
@@ -312,15 +312,6 @@
         <w:t xml:space="preserve">2 Theoretical Background</w:t>
       </w:r>
     </w:p>
-    <w:bookmarkStart w:id="33" w:name="X941155373a4ad130971820c93be074ef10456a6"/>
-    <w:p>
-      <w:pPr>
-        <w:pStyle w:val="Heading3"/>
-      </w:pPr>
-      <w:r>
-        <w:t xml:space="preserve">2.1 ASAG Methods and the Limits of Accuracy-Centred Evaluation</w:t>
-      </w:r>
-    </w:p>
     <w:p>
       <w:pPr>
         <w:pStyle w:val="FirstParagraph"/>
@@ -329,19 +320,9 @@
         <w:t xml:space="preserve">The ASAG literature spans nearly two decades of methodological progress, from lexical and dependency-based approaches (Mohler et al., 2011; Burrows et al., 2015) to transformer-based models (Sung et al., 2019; Condor et al., 2021). Across this trajectory, evaluation has predominantly reported agreement with human raters via accuracy, Quadratic Weighted Kappa, or correlation, while the gap between in-distribution agreement scores and operational reliability has long been a concern of the educational measurement community (Heilman and Madnani, 2015; Williamson et al., 2012; Deane, 2013).</w:t>
       </w:r>
     </w:p>
-    <w:bookmarkEnd w:id="33"/>
-    <w:bookmarkStart w:id="34" w:name="X739cc0cdb3d82bf077170824e090c0f4dcb55fa"/>
-    <w:p>
-      <w:pPr>
-        <w:pStyle w:val="Heading3"/>
-      </w:pPr>
-      <w:r>
-        <w:t xml:space="preserve">2.2 Construct Validity as a Theoretical Foundation</w:t>
-      </w:r>
-    </w:p>
-    <w:p>
-      <w:pPr>
-        <w:pStyle w:val="FirstParagraph"/>
+    <w:p>
+      <w:pPr>
+        <w:pStyle w:val="BodyText"/>
       </w:pPr>
       <w:r>
         <w:t xml:space="preserve">The limits of agreement-based evaluation are best understood through construct validity, that is, the degree to which an assessment measures what it claims to measure (Messick, 1989; Kane, 2006). Messick’s framework identifies two principal threats:</w:t>
@@ -392,19 +373,9 @@
         <w:t xml:space="preserve">, in which surface manipulations such as keyword stuffing artificially inflate scores (Williamson et al., 2012; Ferrara and Qunbar, 2022).</w:t>
       </w:r>
     </w:p>
-    <w:bookmarkEnd w:id="34"/>
-    <w:bookmarkStart w:id="35" w:name="X2b6442997d57334ff190dc35a97f625f72ece4e"/>
-    <w:p>
-      <w:pPr>
-        <w:pStyle w:val="Heading3"/>
-      </w:pPr>
-      <w:r>
-        <w:t xml:space="preserve">2.3 Adversarial and Perturbation-Based Evaluation</w:t>
-      </w:r>
-    </w:p>
-    <w:p>
-      <w:pPr>
-        <w:pStyle w:val="FirstParagraph"/>
+    <w:p>
+      <w:pPr>
+        <w:pStyle w:val="BodyText"/>
       </w:pPr>
       <w:r>
         <w:t xml:space="preserve">Perturbation-based evaluation is a standard methodology for assessing NLP model robustness. Ribeiro et al. (2020) introduced CheckList, a behavioural testing framework that systematically probes model capabilities through invariance, directional, and minimum-functionality tests. The general adversarial-NLP literature provides a wide toolkit of attack strategies, surveyed in Wang et al. (2022).</w:t>
@@ -418,19 +389,9 @@
         <w:t xml:space="preserve">Within automated scoring, adversarial vulnerabilities have been documented but not systematically addressed. Ding et al. (2020) showed that content scoring systems could be fooled by random character strings, Kumar et al. (2020) attacked essay scoring with simple perturbations, and Filighera et al. (2024) extended this work to ASAG via adversarial adjectives and adverbs. Each focuses on a single attack family, and none proposes a unified, multi-dimensional framework anchored to validity theory.</w:t>
       </w:r>
     </w:p>
-    <w:bookmarkEnd w:id="35"/>
-    <w:bookmarkStart w:id="36" w:name="llm-based-scoring-and-open-questions"/>
-    <w:p>
-      <w:pPr>
-        <w:pStyle w:val="Heading3"/>
-      </w:pPr>
-      <w:r>
-        <w:t xml:space="preserve">2.4 LLM-Based Scoring and Open Questions</w:t>
-      </w:r>
-    </w:p>
-    <w:p>
-      <w:pPr>
-        <w:pStyle w:val="FirstParagraph"/>
+    <w:p>
+      <w:pPr>
+        <w:pStyle w:val="BodyText"/>
       </w:pPr>
       <w:r>
         <w:t xml:space="preserve">The emergence of large language models has introduced a new paradigm in which scoring is performed via zero-shot or few-shot prompting rather than supervised training (Mizumoto and Eguchi, 2023; Naismith et al., 2023; Latif and Zhai, 2024). These studies report encouraging accuracy figures but do not characterise robustness. Two questions are pressing: whether the cross-question robustness drop documented for trained models also affects zero-shot LLM graders, and whether prompting interventions (e.g. supplying a reference answer) interact uniformly with all validity dimensions or produce trade-offs invisible to accuracy alone.</w:t>
@@ -443,24 +404,14 @@
         </w:pict>
       </w:r>
     </w:p>
-    <w:bookmarkEnd w:id="36"/>
-    <w:bookmarkEnd w:id="37"/>
-    <w:bookmarkStart w:id="43" w:name="methodology"/>
+    <w:bookmarkEnd w:id="33"/>
+    <w:bookmarkStart w:id="37" w:name="methodology"/>
     <w:p>
       <w:pPr>
         <w:pStyle w:val="Heading2"/>
       </w:pPr>
       <w:r>
         <w:t xml:space="preserve">3 Methodology</w:t>
-      </w:r>
-    </w:p>
-    <w:bookmarkStart w:id="38" w:name="framework-architecture"/>
-    <w:p>
-      <w:pPr>
-        <w:pStyle w:val="Heading3"/>
-      </w:pPr>
-      <w:r>
-        <w:t xml:space="preserve">3.1 Framework Architecture</w:t>
       </w:r>
     </w:p>
     <w:p>
@@ -480,14 +431,13 @@
         <w:t xml:space="preserve">) with a public API and command-line interface; source code, evaluation scripts, and the analyses reported in this paper are available at https://github.com/NNSS666/asag-perturbation-framework.</w:t>
       </w:r>
     </w:p>
-    <w:bookmarkEnd w:id="38"/>
-    <w:bookmarkStart w:id="39" w:name="perturbation-generation"/>
+    <w:bookmarkStart w:id="34" w:name="X25ea66c058de233a597b329f6ebfb251c0672dc"/>
     <w:p>
       <w:pPr>
         <w:pStyle w:val="Heading3"/>
       </w:pPr>
       <w:r>
-        <w:t xml:space="preserve">3.2 Perturbation Generation</w:t>
+        <w:t xml:space="preserve">3.1 Perturbation Generation and Quality Validation</w:t>
       </w:r>
     </w:p>
     <w:p>
@@ -932,16 +882,6 @@
         <w:t xml:space="preserve">”</w:t>
       </w:r>
     </w:p>
-    <w:bookmarkEnd w:id="39"/>
-    <w:bookmarkStart w:id="40" w:name="two-gate-quality-validation"/>
-    <w:p>
-      <w:pPr>
-        <w:pStyle w:val="Heading3"/>
-      </w:pPr>
-      <w:r>
-        <w:t xml:space="preserve">3.3 Two-Gate Quality Validation</w:t>
-      </w:r>
-    </w:p>
     <w:p>
       <w:pPr>
         <w:pStyle w:val="FirstParagraph"/>
@@ -979,17 +919,17 @@
         <w:t xml:space="preserve"> </w:t>
       </w:r>
       <w:r>
-        <w:t xml:space="preserve">gold labels supplied by the dataset (Section 4.1), which encode whether the original student answer is correct.</w:t>
-      </w:r>
-    </w:p>
-    <w:bookmarkEnd w:id="40"/>
-    <w:bookmarkStart w:id="41" w:name="robustness-metrics"/>
+        <w:t xml:space="preserve">gold labels supplied by the dataset (Section 4), which encode whether the original student answer is correct.</w:t>
+      </w:r>
+    </w:p>
+    <w:bookmarkEnd w:id="34"/>
+    <w:bookmarkStart w:id="35" w:name="robustness-metrics"/>
     <w:p>
       <w:pPr>
         <w:pStyle w:val="Heading3"/>
       </w:pPr>
       <w:r>
-        <w:t xml:space="preserve">3.4 Robustness Metrics</w:t>
+        <w:t xml:space="preserve">3.2 Robustness Metrics</w:t>
       </w:r>
     </w:p>
     <w:p>
@@ -1077,17 +1017,17 @@
         <w:pStyle w:val="BodyText"/>
       </w:pPr>
       <w:r>
-        <w:t xml:space="preserve">The four metrics are reported on their canonical scales rather than aggregated into a composite index, which preserves continuity with the validity-theoretic constructs each metric targets and avoids the arbitrariness of weighting heterogeneous dimensions whose practical importance varies by deployment context. Joint reading across the three dimensions, illustrated in Section 5.2, surfaces the trade-offs that single-metric evaluation hides.</w:t>
-      </w:r>
-    </w:p>
-    <w:bookmarkEnd w:id="41"/>
-    <w:bookmarkStart w:id="42" w:name="dual-protocol-evaluation"/>
+        <w:t xml:space="preserve">The four metrics are reported on their canonical scales rather than aggregated into a composite index, which preserves continuity with the validity-theoretic constructs each metric targets and avoids the arbitrariness of weighting heterogeneous dimensions whose practical importance varies by deployment context. Joint reading across the three dimensions, illustrated in Section 5.1, surfaces the trade-offs that single-metric evaluation hides.</w:t>
+      </w:r>
+    </w:p>
+    <w:bookmarkEnd w:id="35"/>
+    <w:bookmarkStart w:id="36" w:name="dual-protocol-evaluation"/>
     <w:p>
       <w:pPr>
         <w:pStyle w:val="Heading3"/>
       </w:pPr>
       <w:r>
-        <w:t xml:space="preserve">3.5 Dual-Protocol Evaluation</w:t>
+        <w:t xml:space="preserve">3.3 Dual-Protocol Evaluation</w:t>
       </w:r>
     </w:p>
     <w:p>
@@ -1129,24 +1069,15 @@
         </w:pict>
       </w:r>
     </w:p>
-    <w:bookmarkEnd w:id="42"/>
-    <w:bookmarkEnd w:id="43"/>
-    <w:bookmarkStart w:id="47" w:name="experimental-setup"/>
+    <w:bookmarkEnd w:id="36"/>
+    <w:bookmarkEnd w:id="37"/>
+    <w:bookmarkStart w:id="40" w:name="experimental-setup"/>
     <w:p>
       <w:pPr>
         <w:pStyle w:val="Heading2"/>
       </w:pPr>
       <w:r>
         <w:t xml:space="preserve">4 Experimental Setup</w:t>
-      </w:r>
-    </w:p>
-    <w:bookmarkStart w:id="44" w:name="dataset"/>
-    <w:p>
-      <w:pPr>
-        <w:pStyle w:val="Heading3"/>
-      </w:pPr>
-      <w:r>
-        <w:t xml:space="preserve">4.1 Dataset</w:t>
       </w:r>
     </w:p>
     <w:p>
@@ -1186,17 +1117,16 @@
         <w:t xml:space="preserve"> </w:t>
       </w:r>
       <w:r>
-        <w:t xml:space="preserve">ground truth is enforced by the two-gate validation of Section 3.3 and by the rule-based construction of each perturbation type. The robustness metrics themselves do not consult either ground truth, since they compare the grader against itself.</w:t>
-      </w:r>
-    </w:p>
-    <w:bookmarkEnd w:id="44"/>
-    <w:bookmarkStart w:id="45" w:name="graders"/>
+        <w:t xml:space="preserve">ground truth is enforced by the two-gate validation of Section 3.1 and by the rule-based construction of each perturbation type. The robustness metrics themselves do not consult either ground truth, since they compare the grader against itself.</w:t>
+      </w:r>
+    </w:p>
+    <w:bookmarkStart w:id="38" w:name="graders"/>
     <w:p>
       <w:pPr>
         <w:pStyle w:val="Heading3"/>
       </w:pPr>
       <w:r>
-        <w:t xml:space="preserve">4.2 Graders</w:t>
+        <w:t xml:space="preserve">4.1 Graders</w:t>
       </w:r>
     </w:p>
     <w:p>
@@ -1235,14 +1165,14 @@
         <w:t xml:space="preserve">Zero-shot prompting of GPT-5.4 mini at two information levels. Level 0 supplies the question and the student answer only; Level 1 additionally supplies the reference answer and instructs the model to compare the student response against it. Temperature is set to 0.0 for near-deterministic output, with a fixed seed for reproducibility, and the model outputs a JSON object with a label and a confidence score mapped to the same [0, 1] scale as the gold labels. Because the model operates in a zero-shot regime, the dual-protocol distinction does not alter its input, and it is evaluated once against the HybridGrader’s Protocol A.</w:t>
       </w:r>
     </w:p>
-    <w:bookmarkEnd w:id="45"/>
-    <w:bookmarkStart w:id="46" w:name="perturbation-statistics"/>
+    <w:bookmarkEnd w:id="38"/>
+    <w:bookmarkStart w:id="39" w:name="perturbation-statistics"/>
     <w:p>
       <w:pPr>
         <w:pStyle w:val="Heading3"/>
       </w:pPr>
       <w:r>
-        <w:t xml:space="preserve">4.3 Perturbation Statistics</w:t>
+        <w:t xml:space="preserve">4.2 Perturbation Statistics</w:t>
       </w:r>
     </w:p>
     <w:p>
@@ -1260,9 +1190,9 @@
         </w:pict>
       </w:r>
     </w:p>
-    <w:bookmarkEnd w:id="46"/>
-    <w:bookmarkEnd w:id="47"/>
-    <w:bookmarkStart w:id="52" w:name="results"/>
+    <w:bookmarkEnd w:id="39"/>
+    <w:bookmarkEnd w:id="40"/>
+    <w:bookmarkStart w:id="44" w:name="results"/>
     <w:p>
       <w:pPr>
         <w:pStyle w:val="Heading2"/>
@@ -1276,21 +1206,20 @@
         <w:pStyle w:val="FirstParagraph"/>
       </w:pPr>
       <w:r>
-        <w:t xml:space="preserve">Results are organised in four parts: dual-protocol analysis of the trained HybridGrader (5.1); cross-paradigm comparison with the zero-shot LLM, including reference-answer availability (5.2); score-distribution artefacts and the floor effect (5.3); and the structured sensitivity-blindness gradient (5.4).</w:t>
-      </w:r>
-    </w:p>
-    <w:bookmarkStart w:id="48" w:name="Xc809b316f312309586489cdd55a59630b36253f"/>
-    <w:p>
-      <w:pPr>
-        <w:pStyle w:val="Heading3"/>
-      </w:pPr>
-      <w:r>
-        <w:t xml:space="preserve">5.1 Dual-Protocol Analysis: Robustness Drop of the Trained Grader</w:t>
-      </w:r>
-    </w:p>
-    <w:p>
-      <w:pPr>
-        <w:pStyle w:val="FirstParagraph"/>
+        <w:t xml:space="preserve">Results are organised in four blocks: a dual-protocol analysis of the trained HybridGrader; a cross-paradigm comparison with the zero-shot LLM, including reference-answer availability (Section 5.1); score-distribution artefacts and the floor effect (Section 5.2); and the structured sensitivity-blindness gradient (Section 5.3). We begin with the dual-protocol analysis.</w:t>
+      </w:r>
+    </w:p>
+    <w:p>
+      <w:pPr>
+        <w:pStyle w:val="BodyText"/>
+      </w:pPr>
+      <w:r>
+        <w:t xml:space="preserve">Table 1 reports the HybridGrader’s aggregate robustness metrics under both evaluation protocols.</w:t>
+      </w:r>
+    </w:p>
+    <w:p>
+      <w:pPr>
+        <w:pStyle w:val="BodyText"/>
       </w:pPr>
       <w:r>
         <w:rPr>
@@ -1567,14 +1496,13 @@
         <w:t xml:space="preserve">Invariance violations nearly double from Protocol B to A (IVR_flip 0.179 → 0.337): the grader changes its score on meaning-preserving perturbations 33.7% of the time on unseen questions, versus 17.9% on familiar ones. Gaming vulnerability follows the same pattern (ASR 0.115 → 0.188), with adversarial inputs 64% more effective on novel questions. Sensitivity detection remains low under both protocols (SSR ≈ 0.13), indicating that the HybridGrader’s failure to detect meaning-altering perturbations is a structural limitation of feature-based scoring rather than a distribution-shift effect. The +15.8 pp IVR_flip and +7.4 pp ASR drops quantify the extent to which within-question evaluations overestimate operational robustness.</w:t>
       </w:r>
     </w:p>
-    <w:bookmarkEnd w:id="48"/>
-    <w:bookmarkStart w:id="49" w:name="X959fd0361b4a45b778be5eae12aea246e63bb00"/>
+    <w:bookmarkStart w:id="41" w:name="X959fd0361b4a45b778be5eae12aea246e63bb00"/>
     <w:p>
       <w:pPr>
         <w:pStyle w:val="Heading3"/>
       </w:pPr>
       <w:r>
-        <w:t xml:space="preserve">5.2 Cross-Paradigm Comparison: Trained ML vs. Zero-Shot LLM</w:t>
+        <w:t xml:space="preserve">5.1 Cross-Paradigm Comparison: Trained ML vs. Zero-Shot LLM</w:t>
       </w:r>
     </w:p>
     <w:p>
@@ -1937,14 +1865,14 @@
         <w:t xml:space="preserve">On invariance alone, Level 1 dominates Level 0; on gaming alone, Level 0 dominates Level 1; on sensitivity alone, the two are comparable. The same point applies to the trained baseline: under Protocol B its IVR_flip of 0.179 looks reasonable, yet SSR_directional of 0.120 reveals that this stability partly reflects indiscrimination, with the grader rarely changing its score even when it should.</w:t>
       </w:r>
     </w:p>
-    <w:bookmarkEnd w:id="49"/>
-    <w:bookmarkStart w:id="50" w:name="score-distribution-effects"/>
+    <w:bookmarkEnd w:id="41"/>
+    <w:bookmarkStart w:id="42" w:name="score-distribution-effects"/>
     <w:p>
       <w:pPr>
         <w:pStyle w:val="Heading3"/>
       </w:pPr>
       <w:r>
-        <w:t xml:space="preserve">5.3 Score Distribution Effects</w:t>
+        <w:t xml:space="preserve">5.2 Score Distribution Effects</w:t>
       </w:r>
     </w:p>
     <w:p>
@@ -2214,14 +2142,14 @@
         <w:t xml:space="preserve">The floor effect is larger for Level 1 because the reference answer makes the grader more discriminative, increasing the proportion of untestable pairs. After correction Level 1 detects 73.1% of meaning-altering perturbations on testable pairs, against 48.0% uncorrected.</w:t>
       </w:r>
     </w:p>
-    <w:bookmarkEnd w:id="50"/>
-    <w:bookmarkStart w:id="51" w:name="sensitivity-blindness-gradient"/>
+    <w:bookmarkEnd w:id="42"/>
+    <w:bookmarkStart w:id="43" w:name="sensitivity-blindness-gradient"/>
     <w:p>
       <w:pPr>
         <w:pStyle w:val="Heading3"/>
       </w:pPr>
       <w:r>
-        <w:t xml:space="preserve">5.4 Sensitivity Blindness Gradient</w:t>
+        <w:t xml:space="preserve">5.3 Sensitivity Blindness Gradient</w:t>
       </w:r>
     </w:p>
     <w:p>
@@ -2419,7 +2347,7 @@
         <w:t xml:space="preserve"> </w:t>
       </w:r>
       <w:r>
-        <w:t xml:space="preserve">it on deletion (+6 pp), a paradox confirmed by paired McNemar on the same answer set (χ² = 51, p &lt; 0.0001). Floor adjustment (Section 5.3) lowers all three rates uniformly without changing the ordering, and even at the bottom (~40% on contradiction in L1) the failure rate constitutes a substantive deployment risk.</w:t>
+        <w:t xml:space="preserve">it on deletion (+6 pp), a paradox confirmed by paired McNemar on the same answer set (χ² = 51, p &lt; 0.0001). Floor adjustment (Section 5.2) lowers all three rates uniformly without changing the ordering, and even at the bottom (~40% on contradiction in L1) the failure rate constitutes a substantive deployment risk.</w:t>
       </w:r>
     </w:p>
     <w:p>
@@ -2502,9 +2430,9 @@
         </w:pict>
       </w:r>
     </w:p>
-    <w:bookmarkEnd w:id="51"/>
-    <w:bookmarkEnd w:id="52"/>
-    <w:bookmarkStart w:id="53" w:name="discussion-implications-and-limitations"/>
+    <w:bookmarkEnd w:id="43"/>
+    <w:bookmarkEnd w:id="44"/>
+    <w:bookmarkStart w:id="45" w:name="discussion-implications-and-limitations"/>
     <w:p>
       <w:pPr>
         <w:pStyle w:val="Heading2"/>
@@ -2534,7 +2462,7 @@
         <w:pStyle w:val="BodyText"/>
       </w:pPr>
       <w:r>
-        <w:t xml:space="preserve">The advantage that the zero-shot LLM exhibits on invariance and sensitivity arises from a form of semantic processing that feature-based scoring lacks. The HybridGrader relies on lexical overlap that shifts with surface form, whereas the LLM processes the answer as language: a negation, deletion or antonym leaves surface features intact while shifting meaning, defeating feature-based scoring yet remaining at least partially visible to a semantic processor. The residual weaknesses in Section 5.4 refine rather than undermine this conclusion, showing that semantic processing handles meaning-preserving variation more reliably than meaning-altering omission.</w:t>
+        <w:t xml:space="preserve">The advantage that the zero-shot LLM exhibits on invariance and sensitivity arises from a form of semantic processing that feature-based scoring lacks. The HybridGrader relies on lexical overlap that shifts with surface form, whereas the LLM processes the answer as language: a negation, deletion or antonym leaves surface features intact while shifting meaning, defeating feature-based scoring yet remaining at least partially visible to a semantic processor. The residual weaknesses in Section 5.3 refine rather than undermine this conclusion, showing that semantic processing handles meaning-preserving variation more reliably than meaning-altering omission.</w:t>
       </w:r>
     </w:p>
     <w:p>
@@ -2542,7 +2470,7 @@
         <w:pStyle w:val="BodyText"/>
       </w:pPr>
       <w:r>
-        <w:t xml:space="preserve">Adding the reference answer is an intervention practitioners commonly expect to improve grading uniformly. It does so for invariance and sensitivity, but for gaming it nearly doubles vulnerability. The mechanism generalises beyond the particular prompt employed here: when the model is instructed to compare the student answer against a reference, any token overlap becomes evidence of correctness, which an adversarial student can exploit. The same checklist mechanism plausibly explains the deletion paradox of Section 5.4: when a domain concept is removed, the reference has no token to compare against while surrounding tokens still match, so the grader reads continued overlap as continued correctness and tolerates the omission. Reference-anchored prompting therefore fails on the same axis on which it succeeds, since token-level matching detects substitutions and negations but cannot detect what is no longer present. Prompt engineering and coherence-first instructions are plausible mitigations, yet such trade-offs remain invisible to single-metric evaluation.</w:t>
+        <w:t xml:space="preserve">Adding the reference answer is an intervention practitioners commonly expect to improve grading uniformly. It does so for invariance and sensitivity, but for gaming it nearly doubles vulnerability. The mechanism generalises beyond the particular prompt employed here: when the model is instructed to compare the student answer against a reference, any token overlap becomes evidence of correctness, which an adversarial student can exploit. The same checklist mechanism plausibly explains the deletion paradox of Section 5.3: when a domain concept is removed, the reference has no token to compare against while surrounding tokens still match, so the grader reads continued overlap as continued correctness and tolerates the omission. Reference-anchored prompting therefore fails on the same axis on which it succeeds, since token-level matching detects substitutions and negations but cannot detect what is no longer present. Prompt engineering and coherence-first instructions are plausible mitigations, yet such trade-offs remain invisible to single-metric evaluation.</w:t>
       </w:r>
     </w:p>
     <w:p>
@@ -2568,8 +2496,8 @@
         </w:pict>
       </w:r>
     </w:p>
-    <w:bookmarkEnd w:id="53"/>
-    <w:bookmarkStart w:id="54" w:name="conclusions"/>
+    <w:bookmarkEnd w:id="45"/>
+    <w:bookmarkStart w:id="46" w:name="conclusions"/>
     <w:p>
       <w:pPr>
         <w:pStyle w:val="Heading2"/>
@@ -2601,8 +2529,8 @@
         </w:pict>
       </w:r>
     </w:p>
-    <w:bookmarkEnd w:id="54"/>
-    <w:bookmarkStart w:id="55" w:name="ethics-declaration"/>
+    <w:bookmarkEnd w:id="46"/>
+    <w:bookmarkStart w:id="47" w:name="ethics-declaration"/>
     <w:p>
       <w:pPr>
         <w:pStyle w:val="Heading2"/>
@@ -2619,8 +2547,8 @@
         <w:t xml:space="preserve">This study uses publicly available data from the SemEval 2013 Task 7 Beetle benchmark, which contains anonymised student responses released by the dataset authors for research purposes (Dzikovska et al., 2013). No primary data collection involving human participants was carried out for the present study, and no ethical clearance was required.</w:t>
       </w:r>
     </w:p>
-    <w:bookmarkEnd w:id="55"/>
-    <w:bookmarkStart w:id="56" w:name="ai-declaration"/>
+    <w:bookmarkEnd w:id="47"/>
+    <w:bookmarkStart w:id="48" w:name="ai-declaration"/>
     <w:p>
       <w:pPr>
         <w:pStyle w:val="Heading2"/>
@@ -2634,7 +2562,7 @@
         <w:pStyle w:val="FirstParagraph"/>
       </w:pPr>
       <w:r>
-        <w:t xml:space="preserve">Artificial intelligence tools were used in two ways. First, OpenAI’s GPT-5.4 mini was the object of evaluation as one of the graders studied; its prompting configuration, decoding parameters, and access conditions are documented in Section 4.2, and the resulting outputs are reported without modification. Second, general-purpose LLMs (Anthropic Claude and OpenAI GPT) were employed as writing assistants during manuscript preparation, specifically for grammar and style proof-reading, terminology consistency checks, and rephrasing suggestions on author-drafted text. All scientific content, research design, analyses, results, and interpretations are the authors’ own. AI-generated wording was reviewed, edited, and retained only where consistent with the authors’ intent and with the underlying empirical evidence.</w:t>
+        <w:t xml:space="preserve">Artificial intelligence tools were used in two ways. First, OpenAI’s GPT-5.4 mini was the object of evaluation as one of the graders studied; its prompting configuration, decoding parameters, and access conditions are documented in Section 4.1, and the resulting outputs are reported without modification. Second, general-purpose LLMs (Anthropic Claude and OpenAI GPT) were employed as writing assistants during manuscript preparation, specifically for grammar and style proof-reading, terminology consistency checks, and rephrasing suggestions on author-drafted text. All scientific content, research design, analyses, results, and interpretations are the authors’ own. AI-generated wording was reviewed, edited, and retained only where consistent with the authors’ intent and with the underlying empirical evidence.</w:t>
       </w:r>
     </w:p>
     <w:p>
@@ -2644,8 +2572,8 @@
         </w:pict>
       </w:r>
     </w:p>
-    <w:bookmarkEnd w:id="56"/>
-    <w:bookmarkStart w:id="57" w:name="references"/>
+    <w:bookmarkEnd w:id="48"/>
+    <w:bookmarkStart w:id="49" w:name="references"/>
     <w:p>
       <w:pPr>
         <w:pStyle w:val="Heading2"/>
@@ -3329,7 +3257,7 @@
         <w:t xml:space="preserve">, 31(1), pp. 2–13.</w:t>
       </w:r>
     </w:p>
-    <w:bookmarkEnd w:id="57"/>
+    <w:bookmarkEnd w:id="49"/>
     <w:sectPr>
       <w:headerReference r:id="rId11" w:type="even"/>
       <w:footerReference r:id="rId12" w:type="even"/>

</xml_diff>

<commit_message>
paper: replace 'Box 1' label with simple lead-in sentence
The 'Box 1.' label implied a visual frame not present in the docx.
Replaced with a plain academic introduction to the bullet list.
</commit_message>
<xml_diff>
--- a/paper/IFKAD2026_Sasso_DeMauro_v3.docx
+++ b/paper/IFKAD2026_Sasso_DeMauro_v3.docx
@@ -573,17 +573,7 @@
         <w:pStyle w:val="BodyText"/>
       </w:pPr>
       <w:r>
-        <w:rPr>
-          <w:b/>
-          <w:bCs/>
-        </w:rPr>
-        <w:t xml:space="preserve">Box 1. Examples</w:t>
-      </w:r>
-      <w:r>
-        <w:t xml:space="preserve"> </w:t>
-      </w:r>
-      <w:r>
-        <w:t xml:space="preserve">(perturbation in</w:t>
+        <w:t xml:space="preserve">Illustrative examples for each perturbation type are reported below, with the perturbation marked in</w:t>
       </w:r>
       <w:r>
         <w:t xml:space="preserve"> </w:t>
@@ -596,7 +586,7 @@
         <w:t xml:space="preserve">bold</w:t>
       </w:r>
       <w:r>
-        <w:t xml:space="preserve">):</w:t>
+        <w:t xml:space="preserve">:</w:t>
       </w:r>
     </w:p>
     <w:p>

</xml_diff>